<commit_message>
fix: contrato e login da PJ usam login do CNPJ com e-mail institucional
Co-Authored-By: Claude Opus 5.5 <noreply@anthropic.com>
</commit_message>
<xml_diff>
--- a/backend/src/templates/incentivo-esporte/contrato-consultoria.docx
+++ b/backend/src/templates/incentivo-esporte/contrato-consultoria.docx
@@ -406,6 +406,11 @@
       </w:r>
     </w:p>
     <w:p>
+      <w:r>
+        <w:t>{#pf}</w:t>
+      </w:r>
+    </w:p>
+    <w:p>
       <w:pPr>
         <w:jc w:val="both"/>
       </w:pPr>
@@ -413,7 +418,7 @@
         <w:rPr>
           <w:b w:val="0"/>
         </w:rPr>
-        <w:t>4.1. O protocolo é feito com login e senha individuais do e-Cidadão, pelo CPF do próprio proponente — na pessoa física, o atleta ou técnico; na pessoa jurídica, o seu representante legal (arts. 13 e 19 da Resolução).</w:t>
+        <w:t>4.1. O protocolo é feito com login e senha individuais do e-Cidadão, pelo CPF do próprio proponente (arts. 13 e 19 da Resolução).</w:t>
       </w:r>
     </w:p>
     <w:p>
@@ -448,6 +453,66 @@
           <w:b w:val="0"/>
         </w:rPr>
         <w:t>4.3. O CONTRATANTE declara estar ciente de que todo protocolo feito com suas credenciais é feito em seu nome e sob sua responsabilidade perante a Prefeitura, e que conferiu e aprovou o conteúdo antes do envio (cláusula 2.3).</w:t>
+      </w:r>
+    </w:p>
+    <w:p>
+      <w:r>
+        <w:t>{/pf}</w:t>
+      </w:r>
+    </w:p>
+    <w:p>
+      <w:r>
+        <w:t>{#pj}</w:t>
+      </w:r>
+    </w:p>
+    <w:p>
+      <w:pPr>
+        <w:jc w:val="both"/>
+      </w:pPr>
+      <w:r>
+        <w:rPr>
+          <w:b w:val="0"/>
+        </w:rPr>
+        <w:t>4.1. O acesso ao Sistema Incentivo online é feito por login cadastrado para o CNPJ do CONTRATANTE, vinculado ao e-mail institucional da entidade ({pj_email_institucional}), que o CONTRATANTE fornecerá ao CONTRATADO e manterá ativo durante a vigência deste contrato.</w:t>
+      </w:r>
+    </w:p>
+    <w:p>
+      <w:pPr>
+        <w:jc w:val="both"/>
+      </w:pPr>
+      <w:r>
+        <w:rPr>
+          <w:b w:val="0"/>
+        </w:rPr>
+        <w:t xml:space="preserve">4.2. O CONTRATANTE, por seu representante legal, </w:t>
+      </w:r>
+      <w:r>
+        <w:rPr>
+          <w:b/>
+        </w:rPr>
+        <w:t>autoriza expressamente</w:t>
+      </w:r>
+      <w:r>
+        <w:rPr>
+          <w:b w:val="0"/>
+        </w:rPr>
+        <w:t xml:space="preserve"> o CONTRATADO a criar, se ainda não existir, e a acessar esse login, exclusivamente para executar o objeto deste contrato.</w:t>
+      </w:r>
+    </w:p>
+    <w:p>
+      <w:pPr>
+        <w:jc w:val="both"/>
+      </w:pPr>
+      <w:r>
+        <w:rPr>
+          <w:b w:val="0"/>
+        </w:rPr>
+        <w:t>4.3. O CONTRATANTE declara estar ciente de que todo protocolo feito com esse login é feito em nome da entidade e sob sua responsabilidade perante a Prefeitura, e que conferiu e aprovou o conteúdo antes do envio (cláusula 2.3).</w:t>
+      </w:r>
+    </w:p>
+    <w:p>
+      <w:r>
+        <w:t>{/pj}</w:t>
       </w:r>
     </w:p>
     <w:p>

</xml_diff>

<commit_message>
fix: remove testemunhas do contrato de consultoria
Co-Authored-By: Claude Opus 5.5 <noreply@anthropic.com>
</commit_message>
<xml_diff>
--- a/backend/src/templates/incentivo-esporte/contrato-consultoria.docx
+++ b/backend/src/templates/incentivo-esporte/contrato-consultoria.docx
@@ -914,7 +914,7 @@
         <w:rPr>
           <w:b w:val="0"/>
         </w:rPr>
-        <w:t>E, por estarem de acordo, as partes assinam este contrato em 2 (duas) vias de igual teor, ou eletronicamente (gov.br ou certificado digital), na presença de 2 (duas) testemunhas.</w:t>
+        <w:t>E, por estarem de acordo, as partes assinam este contrato eletronicamente (gov.br ou certificado digital) ou em 2 (duas) vias de igual teor.</w:t>
       </w:r>
     </w:p>
     <w:p>
@@ -1071,40 +1071,6 @@
     <w:p>
       <w:r>
         <w:t>{/menor}</w:t>
-      </w:r>
-    </w:p>
-    <w:p/>
-    <w:p>
-      <w:pPr>
-        <w:jc w:val="left"/>
-      </w:pPr>
-      <w:r>
-        <w:rPr>
-          <w:b/>
-        </w:rPr>
-        <w:t>Testemunhas:</w:t>
-      </w:r>
-    </w:p>
-    <w:p>
-      <w:pPr>
-        <w:jc w:val="left"/>
-      </w:pPr>
-      <w:r>
-        <w:rPr>
-          <w:b w:val="0"/>
-        </w:rPr>
-        <w:t>1. Nome: ______________________________ CPF: ________________ Assinatura: ________________</w:t>
-      </w:r>
-    </w:p>
-    <w:p>
-      <w:pPr>
-        <w:jc w:val="left"/>
-      </w:pPr>
-      <w:r>
-        <w:rPr>
-          <w:b w:val="0"/>
-        </w:rPr>
-        <w:t>2. Nome: ______________________________ CPF: ________________ Assinatura: ________________</w:t>
       </w:r>
     </w:p>
     <w:sectPr>

</xml_diff>

<commit_message>
feat: contrato com remuneração de 20% limitada a R$ 1.500 em até 10 parcelas
Co-Authored-By: Claude Opus 5.5 <noreply@anthropic.com>
</commit_message>
<xml_diff>
--- a/backend/src/templates/incentivo-esporte/contrato-consultoria.docx
+++ b/backend/src/templates/incentivo-esporte/contrato-consultoria.docx
@@ -557,7 +557,19 @@
         <w:rPr>
           <w:b w:val="0"/>
         </w:rPr>
-        <w:t xml:space="preserve"> para o projeto no Programa.</w:t>
+        <w:t xml:space="preserve"> para o projeto no Programa, </w:t>
+      </w:r>
+      <w:r>
+        <w:rPr>
+          <w:b/>
+        </w:rPr>
+        <w:t>limitado a {teto} ({teto_extenso})</w:t>
+      </w:r>
+      <w:r>
+        <w:rPr>
+          <w:b w:val="0"/>
+        </w:rPr>
+        <w:t>.</w:t>
       </w:r>
     </w:p>
     <w:p>
@@ -620,7 +632,7 @@
     </w:p>
     <w:p>
       <w:r>
-        <w:t>{#pagamento_unico}</w:t>
+        <w:t>{#parcela_unica}</w:t>
       </w:r>
     </w:p>
     <w:p>
@@ -648,12 +660,12 @@
     </w:p>
     <w:p>
       <w:r>
-        <w:t>{/pagamento_unico}</w:t>
+        <w:t>{/parcela_unica}</w:t>
       </w:r>
     </w:p>
     <w:p>
       <w:r>
-        <w:t>{#pagamento_proporcional}</w:t>
+        <w:t>{#parcelado}</w:t>
       </w:r>
     </w:p>
     <w:p>
@@ -676,12 +688,12 @@
         <w:rPr>
           <w:b w:val="0"/>
         </w:rPr>
-        <w:t xml:space="preserve"> proporcionalmente, {percentual} de cada parcela do incentivo, até {prazo_pagamento_dias} dias após cada recebimento, via {forma_pagamento}.</w:t>
+        <w:t xml:space="preserve"> em {parcelas} ({parcelas_extenso}) parcelas mensais, iguais e sucessivas, a primeira com vencimento em até {prazo_pagamento_dias} dias após o recebimento da primeira parcela do incentivo e as demais no mesmo dia dos meses seguintes, via {forma_pagamento}.</w:t>
       </w:r>
     </w:p>
     <w:p>
       <w:r>
-        <w:t>{/pagamento_proporcional}</w:t>
+        <w:t>{/parcelado}</w:t>
       </w:r>
     </w:p>
     <w:p>

</xml_diff>